<commit_message>
Keep the single-column tables on one page
Table 2 was landing across a page break, with the ResNet18 row at the foot of one
page and ResNet50 at the head of the next. Those two rows exist to be compared, and
a reader cannot compare them while turning a page.

Every row now keeps with the row after it, which makes Word move a whole table down
rather than break it, and the last row keeps with the caption that sits underneath.
Applied to all twelve tables rather than to the one that happened to fall badly,
since where a table lands depends on everything written above it.

Verified against the render: the header row of Table 2 and both backbone rows are
on one page, where before the header page carried ResNet18 and not ResNet50. Still
fifteen pages, and the layout audit is clean.

Co-Authored-By: Claude Opus 5 <noreply@anthropic.com>
</commit_message>
<xml_diff>
--- a/paper/Explainable_ChestXray_Paper_singlecolumn.docx
+++ b/paper/Explainable_ChestXray_Paper_singlecolumn.docx
@@ -669,6 +669,7 @@
           </w:tcPr>
           <w:p>
             <w:pPr>
+              <w:keepNext/>
               <w:jc w:val="center"/>
             </w:pPr>
             <w:r/>
@@ -688,6 +689,7 @@
           </w:tcPr>
           <w:p>
             <w:pPr>
+              <w:keepNext/>
               <w:jc w:val="center"/>
             </w:pPr>
             <w:r/>
@@ -707,6 +709,7 @@
           </w:tcPr>
           <w:p>
             <w:pPr>
+              <w:keepNext/>
               <w:jc w:val="center"/>
             </w:pPr>
             <w:r/>
@@ -728,6 +731,7 @@
           </w:tcPr>
           <w:p>
             <w:pPr>
+              <w:keepNext/>
               <w:jc w:val="left"/>
             </w:pPr>
             <w:r>
@@ -752,6 +756,7 @@
           </w:tcPr>
           <w:p>
             <w:pPr>
+              <w:keepNext/>
               <w:jc w:val="center"/>
             </w:pPr>
             <w:r>
@@ -776,6 +781,7 @@
           </w:tcPr>
           <w:p>
             <w:pPr>
+              <w:keepNext/>
               <w:jc w:val="center"/>
             </w:pPr>
             <w:r>
@@ -802,6 +808,7 @@
           </w:tcPr>
           <w:p>
             <w:pPr>
+              <w:keepNext/>
               <w:jc w:val="left"/>
             </w:pPr>
             <w:r>
@@ -826,6 +833,7 @@
           </w:tcPr>
           <w:p>
             <w:pPr>
+              <w:keepNext/>
               <w:jc w:val="center"/>
             </w:pPr>
             <w:r>
@@ -850,6 +858,7 @@
           </w:tcPr>
           <w:p>
             <w:pPr>
+              <w:keepNext/>
               <w:jc w:val="center"/>
             </w:pPr>
             <w:r>
@@ -876,6 +885,7 @@
           </w:tcPr>
           <w:p>
             <w:pPr>
+              <w:keepNext/>
               <w:jc w:val="left"/>
             </w:pPr>
             <w:r>
@@ -900,6 +910,7 @@
           </w:tcPr>
           <w:p>
             <w:pPr>
+              <w:keepNext/>
               <w:jc w:val="center"/>
             </w:pPr>
             <w:r>
@@ -924,6 +935,7 @@
           </w:tcPr>
           <w:p>
             <w:pPr>
+              <w:keepNext/>
               <w:jc w:val="center"/>
             </w:pPr>
             <w:r>
@@ -950,6 +962,7 @@
           </w:tcPr>
           <w:p>
             <w:pPr>
+              <w:keepNext/>
               <w:jc w:val="left"/>
             </w:pPr>
             <w:r>
@@ -974,6 +987,7 @@
           </w:tcPr>
           <w:p>
             <w:pPr>
+              <w:keepNext/>
               <w:jc w:val="center"/>
             </w:pPr>
             <w:r>
@@ -998,6 +1012,7 @@
           </w:tcPr>
           <w:p>
             <w:pPr>
+              <w:keepNext/>
               <w:jc w:val="center"/>
             </w:pPr>
             <w:r>
@@ -1024,6 +1039,7 @@
           </w:tcPr>
           <w:p>
             <w:pPr>
+              <w:keepNext/>
               <w:jc w:val="left"/>
             </w:pPr>
             <w:r>
@@ -1048,6 +1064,7 @@
           </w:tcPr>
           <w:p>
             <w:pPr>
+              <w:keepNext/>
               <w:jc w:val="center"/>
             </w:pPr>
             <w:r>
@@ -1072,6 +1089,7 @@
           </w:tcPr>
           <w:p>
             <w:pPr>
+              <w:keepNext/>
               <w:jc w:val="center"/>
             </w:pPr>
             <w:r>
@@ -1098,6 +1116,7 @@
           </w:tcPr>
           <w:p>
             <w:pPr>
+              <w:keepNext/>
               <w:jc w:val="left"/>
             </w:pPr>
             <w:r>
@@ -1122,6 +1141,7 @@
           </w:tcPr>
           <w:p>
             <w:pPr>
+              <w:keepNext/>
               <w:jc w:val="center"/>
             </w:pPr>
             <w:r>
@@ -1146,6 +1166,7 @@
           </w:tcPr>
           <w:p>
             <w:pPr>
+              <w:keepNext/>
               <w:jc w:val="center"/>
             </w:pPr>
             <w:r>
@@ -1172,6 +1193,7 @@
           </w:tcPr>
           <w:p>
             <w:pPr>
+              <w:keepNext/>
               <w:jc w:val="left"/>
             </w:pPr>
             <w:r>
@@ -1196,6 +1218,7 @@
           </w:tcPr>
           <w:p>
             <w:pPr>
+              <w:keepNext/>
               <w:jc w:val="center"/>
             </w:pPr>
             <w:r>
@@ -1220,6 +1243,7 @@
           </w:tcPr>
           <w:p>
             <w:pPr>
+              <w:keepNext/>
               <w:jc w:val="center"/>
             </w:pPr>
             <w:r>
@@ -1246,6 +1270,7 @@
           </w:tcPr>
           <w:p>
             <w:pPr>
+              <w:keepNext/>
               <w:jc w:val="left"/>
             </w:pPr>
             <w:r>
@@ -1270,6 +1295,7 @@
           </w:tcPr>
           <w:p>
             <w:pPr>
+              <w:keepNext/>
               <w:jc w:val="center"/>
             </w:pPr>
             <w:r>
@@ -1294,6 +1320,7 @@
           </w:tcPr>
           <w:p>
             <w:pPr>
+              <w:keepNext/>
               <w:jc w:val="center"/>
             </w:pPr>
             <w:r>
@@ -1394,6 +1421,7 @@
           </w:tcPr>
           <w:p>
             <w:pPr>
+              <w:keepNext/>
               <w:jc w:val="center"/>
             </w:pPr>
             <w:r/>
@@ -1413,6 +1441,7 @@
           </w:tcPr>
           <w:p>
             <w:pPr>
+              <w:keepNext/>
               <w:jc w:val="center"/>
             </w:pPr>
             <w:r/>
@@ -1432,6 +1461,7 @@
           </w:tcPr>
           <w:p>
             <w:pPr>
+              <w:keepNext/>
               <w:jc w:val="center"/>
             </w:pPr>
             <w:r/>
@@ -1451,6 +1481,7 @@
           </w:tcPr>
           <w:p>
             <w:pPr>
+              <w:keepNext/>
               <w:jc w:val="center"/>
             </w:pPr>
             <w:r/>
@@ -1470,6 +1501,7 @@
           </w:tcPr>
           <w:p>
             <w:pPr>
+              <w:keepNext/>
               <w:jc w:val="center"/>
             </w:pPr>
             <w:r/>
@@ -1489,6 +1521,7 @@
           </w:tcPr>
           <w:p>
             <w:pPr>
+              <w:keepNext/>
               <w:jc w:val="center"/>
             </w:pPr>
             <w:r/>
@@ -1508,6 +1541,7 @@
           </w:tcPr>
           <w:p>
             <w:pPr>
+              <w:keepNext/>
               <w:jc w:val="center"/>
             </w:pPr>
             <w:r/>
@@ -1529,6 +1563,7 @@
           </w:tcPr>
           <w:p>
             <w:pPr>
+              <w:keepNext/>
               <w:jc w:val="left"/>
             </w:pPr>
             <w:r>
@@ -1553,6 +1588,7 @@
           </w:tcPr>
           <w:p>
             <w:pPr>
+              <w:keepNext/>
               <w:jc w:val="center"/>
             </w:pPr>
             <w:r>
@@ -1577,6 +1613,7 @@
           </w:tcPr>
           <w:p>
             <w:pPr>
+              <w:keepNext/>
               <w:jc w:val="center"/>
             </w:pPr>
             <w:r>
@@ -1601,6 +1638,7 @@
           </w:tcPr>
           <w:p>
             <w:pPr>
+              <w:keepNext/>
               <w:jc w:val="center"/>
             </w:pPr>
             <w:r>
@@ -1625,6 +1663,7 @@
           </w:tcPr>
           <w:p>
             <w:pPr>
+              <w:keepNext/>
               <w:jc w:val="center"/>
             </w:pPr>
             <w:r>
@@ -1649,6 +1688,7 @@
           </w:tcPr>
           <w:p>
             <w:pPr>
+              <w:keepNext/>
               <w:jc w:val="center"/>
             </w:pPr>
             <w:r>
@@ -1673,6 +1713,7 @@
           </w:tcPr>
           <w:p>
             <w:pPr>
+              <w:keepNext/>
               <w:jc w:val="center"/>
             </w:pPr>
             <w:r>
@@ -1699,6 +1740,7 @@
           </w:tcPr>
           <w:p>
             <w:pPr>
+              <w:keepNext/>
               <w:jc w:val="left"/>
             </w:pPr>
             <w:r>
@@ -1723,6 +1765,7 @@
           </w:tcPr>
           <w:p>
             <w:pPr>
+              <w:keepNext/>
               <w:jc w:val="center"/>
             </w:pPr>
             <w:r>
@@ -1747,6 +1790,7 @@
           </w:tcPr>
           <w:p>
             <w:pPr>
+              <w:keepNext/>
               <w:jc w:val="center"/>
             </w:pPr>
             <w:r>
@@ -1771,6 +1815,7 @@
           </w:tcPr>
           <w:p>
             <w:pPr>
+              <w:keepNext/>
               <w:jc w:val="center"/>
             </w:pPr>
             <w:r>
@@ -1795,6 +1840,7 @@
           </w:tcPr>
           <w:p>
             <w:pPr>
+              <w:keepNext/>
               <w:jc w:val="center"/>
             </w:pPr>
             <w:r>
@@ -1819,6 +1865,7 @@
           </w:tcPr>
           <w:p>
             <w:pPr>
+              <w:keepNext/>
               <w:jc w:val="center"/>
             </w:pPr>
             <w:r>
@@ -1843,6 +1890,7 @@
           </w:tcPr>
           <w:p>
             <w:pPr>
+              <w:keepNext/>
               <w:jc w:val="center"/>
             </w:pPr>
             <w:r>
@@ -1910,6 +1958,7 @@
           </w:tcPr>
           <w:p>
             <w:pPr>
+              <w:keepNext/>
               <w:jc w:val="center"/>
             </w:pPr>
             <w:r/>
@@ -1929,6 +1978,7 @@
           </w:tcPr>
           <w:p>
             <w:pPr>
+              <w:keepNext/>
               <w:jc w:val="center"/>
             </w:pPr>
             <w:r/>
@@ -1948,6 +1998,7 @@
           </w:tcPr>
           <w:p>
             <w:pPr>
+              <w:keepNext/>
               <w:jc w:val="center"/>
             </w:pPr>
             <w:r/>
@@ -1969,6 +2020,7 @@
           </w:tcPr>
           <w:p>
             <w:pPr>
+              <w:keepNext/>
               <w:jc w:val="left"/>
             </w:pPr>
             <w:r>
@@ -1993,6 +2045,7 @@
           </w:tcPr>
           <w:p>
             <w:pPr>
+              <w:keepNext/>
               <w:jc w:val="center"/>
             </w:pPr>
             <w:r>
@@ -2017,6 +2070,7 @@
           </w:tcPr>
           <w:p>
             <w:pPr>
+              <w:keepNext/>
               <w:jc w:val="center"/>
             </w:pPr>
             <w:r>
@@ -2043,6 +2097,7 @@
           </w:tcPr>
           <w:p>
             <w:pPr>
+              <w:keepNext/>
               <w:jc w:val="left"/>
             </w:pPr>
             <w:r>
@@ -2067,6 +2122,7 @@
           </w:tcPr>
           <w:p>
             <w:pPr>
+              <w:keepNext/>
               <w:jc w:val="center"/>
             </w:pPr>
             <w:r>
@@ -2091,6 +2147,7 @@
           </w:tcPr>
           <w:p>
             <w:pPr>
+              <w:keepNext/>
               <w:jc w:val="center"/>
             </w:pPr>
             <w:r>
@@ -2117,6 +2174,7 @@
           </w:tcPr>
           <w:p>
             <w:pPr>
+              <w:keepNext/>
               <w:jc w:val="left"/>
             </w:pPr>
             <w:r>
@@ -2141,6 +2199,7 @@
           </w:tcPr>
           <w:p>
             <w:pPr>
+              <w:keepNext/>
               <w:jc w:val="center"/>
             </w:pPr>
             <w:r>
@@ -2165,6 +2224,7 @@
           </w:tcPr>
           <w:p>
             <w:pPr>
+              <w:keepNext/>
               <w:jc w:val="center"/>
             </w:pPr>
             <w:r>
@@ -2191,6 +2251,7 @@
           </w:tcPr>
           <w:p>
             <w:pPr>
+              <w:keepNext/>
               <w:jc w:val="left"/>
             </w:pPr>
             <w:r>
@@ -2215,6 +2276,7 @@
           </w:tcPr>
           <w:p>
             <w:pPr>
+              <w:keepNext/>
               <w:jc w:val="center"/>
             </w:pPr>
             <w:r>
@@ -2239,6 +2301,7 @@
           </w:tcPr>
           <w:p>
             <w:pPr>
+              <w:keepNext/>
               <w:jc w:val="center"/>
             </w:pPr>
             <w:r>
@@ -2341,6 +2404,7 @@
           </w:tcPr>
           <w:p>
             <w:pPr>
+              <w:keepNext/>
               <w:jc w:val="center"/>
             </w:pPr>
             <w:r/>
@@ -2360,6 +2424,7 @@
           </w:tcPr>
           <w:p>
             <w:pPr>
+              <w:keepNext/>
               <w:jc w:val="center"/>
             </w:pPr>
             <w:r/>
@@ -2379,6 +2444,7 @@
           </w:tcPr>
           <w:p>
             <w:pPr>
+              <w:keepNext/>
               <w:jc w:val="center"/>
             </w:pPr>
             <w:r/>
@@ -2398,6 +2464,7 @@
           </w:tcPr>
           <w:p>
             <w:pPr>
+              <w:keepNext/>
               <w:jc w:val="center"/>
             </w:pPr>
             <w:r/>
@@ -2417,6 +2484,7 @@
           </w:tcPr>
           <w:p>
             <w:pPr>
+              <w:keepNext/>
               <w:jc w:val="center"/>
             </w:pPr>
             <w:r/>
@@ -2436,6 +2504,7 @@
           </w:tcPr>
           <w:p>
             <w:pPr>
+              <w:keepNext/>
               <w:jc w:val="center"/>
             </w:pPr>
             <w:r/>
@@ -2455,6 +2524,7 @@
           </w:tcPr>
           <w:p>
             <w:pPr>
+              <w:keepNext/>
               <w:jc w:val="center"/>
             </w:pPr>
             <w:r/>
@@ -2476,6 +2546,7 @@
           </w:tcPr>
           <w:p>
             <w:pPr>
+              <w:keepNext/>
               <w:jc w:val="left"/>
             </w:pPr>
             <w:r>
@@ -2500,6 +2571,7 @@
           </w:tcPr>
           <w:p>
             <w:pPr>
+              <w:keepNext/>
               <w:jc w:val="center"/>
             </w:pPr>
             <w:r>
@@ -2524,6 +2596,7 @@
           </w:tcPr>
           <w:p>
             <w:pPr>
+              <w:keepNext/>
               <w:jc w:val="center"/>
             </w:pPr>
             <w:r>
@@ -2548,6 +2621,7 @@
           </w:tcPr>
           <w:p>
             <w:pPr>
+              <w:keepNext/>
               <w:jc w:val="center"/>
             </w:pPr>
             <w:r>
@@ -2572,6 +2646,7 @@
           </w:tcPr>
           <w:p>
             <w:pPr>
+              <w:keepNext/>
               <w:jc w:val="center"/>
             </w:pPr>
             <w:r>
@@ -2596,6 +2671,7 @@
           </w:tcPr>
           <w:p>
             <w:pPr>
+              <w:keepNext/>
               <w:jc w:val="center"/>
             </w:pPr>
             <w:r>
@@ -2620,6 +2696,7 @@
           </w:tcPr>
           <w:p>
             <w:pPr>
+              <w:keepNext/>
               <w:jc w:val="center"/>
             </w:pPr>
             <w:r>
@@ -2646,6 +2723,7 @@
           </w:tcPr>
           <w:p>
             <w:pPr>
+              <w:keepNext/>
               <w:jc w:val="left"/>
             </w:pPr>
             <w:r>
@@ -2670,6 +2748,7 @@
           </w:tcPr>
           <w:p>
             <w:pPr>
+              <w:keepNext/>
               <w:jc w:val="center"/>
             </w:pPr>
             <w:r>
@@ -2694,6 +2773,7 @@
           </w:tcPr>
           <w:p>
             <w:pPr>
+              <w:keepNext/>
               <w:jc w:val="center"/>
             </w:pPr>
             <w:r>
@@ -2718,6 +2798,7 @@
           </w:tcPr>
           <w:p>
             <w:pPr>
+              <w:keepNext/>
               <w:jc w:val="center"/>
             </w:pPr>
             <w:r>
@@ -2742,6 +2823,7 @@
           </w:tcPr>
           <w:p>
             <w:pPr>
+              <w:keepNext/>
               <w:jc w:val="center"/>
             </w:pPr>
             <w:r>
@@ -2766,6 +2848,7 @@
           </w:tcPr>
           <w:p>
             <w:pPr>
+              <w:keepNext/>
               <w:jc w:val="center"/>
             </w:pPr>
             <w:r>
@@ -2790,6 +2873,7 @@
           </w:tcPr>
           <w:p>
             <w:pPr>
+              <w:keepNext/>
               <w:jc w:val="center"/>
             </w:pPr>
             <w:r>
@@ -2816,6 +2900,7 @@
           </w:tcPr>
           <w:p>
             <w:pPr>
+              <w:keepNext/>
               <w:jc w:val="left"/>
             </w:pPr>
             <w:r>
@@ -2840,6 +2925,7 @@
           </w:tcPr>
           <w:p>
             <w:pPr>
+              <w:keepNext/>
               <w:jc w:val="center"/>
             </w:pPr>
             <w:r>
@@ -2864,6 +2950,7 @@
           </w:tcPr>
           <w:p>
             <w:pPr>
+              <w:keepNext/>
               <w:jc w:val="center"/>
             </w:pPr>
             <w:r>
@@ -2888,6 +2975,7 @@
           </w:tcPr>
           <w:p>
             <w:pPr>
+              <w:keepNext/>
               <w:jc w:val="center"/>
             </w:pPr>
             <w:r>
@@ -2912,6 +3000,7 @@
           </w:tcPr>
           <w:p>
             <w:pPr>
+              <w:keepNext/>
               <w:jc w:val="center"/>
             </w:pPr>
             <w:r>
@@ -2936,6 +3025,7 @@
           </w:tcPr>
           <w:p>
             <w:pPr>
+              <w:keepNext/>
               <w:jc w:val="center"/>
             </w:pPr>
             <w:r>
@@ -2960,6 +3050,7 @@
           </w:tcPr>
           <w:p>
             <w:pPr>
+              <w:keepNext/>
               <w:jc w:val="center"/>
             </w:pPr>
             <w:r>
@@ -2986,6 +3077,7 @@
           </w:tcPr>
           <w:p>
             <w:pPr>
+              <w:keepNext/>
               <w:jc w:val="left"/>
             </w:pPr>
             <w:r>
@@ -3010,6 +3102,7 @@
           </w:tcPr>
           <w:p>
             <w:pPr>
+              <w:keepNext/>
               <w:jc w:val="center"/>
             </w:pPr>
             <w:r>
@@ -3034,6 +3127,7 @@
           </w:tcPr>
           <w:p>
             <w:pPr>
+              <w:keepNext/>
               <w:jc w:val="center"/>
             </w:pPr>
             <w:r>
@@ -3058,6 +3152,7 @@
           </w:tcPr>
           <w:p>
             <w:pPr>
+              <w:keepNext/>
               <w:jc w:val="center"/>
             </w:pPr>
             <w:r>
@@ -3082,6 +3177,7 @@
           </w:tcPr>
           <w:p>
             <w:pPr>
+              <w:keepNext/>
               <w:jc w:val="center"/>
             </w:pPr>
             <w:r>
@@ -3106,6 +3202,7 @@
           </w:tcPr>
           <w:p>
             <w:pPr>
+              <w:keepNext/>
               <w:jc w:val="center"/>
             </w:pPr>
             <w:r>
@@ -3130,6 +3227,7 @@
           </w:tcPr>
           <w:p>
             <w:pPr>
+              <w:keepNext/>
               <w:jc w:val="center"/>
             </w:pPr>
             <w:r>
@@ -3292,6 +3390,7 @@
           </w:tcPr>
           <w:p>
             <w:pPr>
+              <w:keepNext/>
               <w:jc w:val="center"/>
             </w:pPr>
             <w:r/>
@@ -3311,6 +3410,7 @@
           </w:tcPr>
           <w:p>
             <w:pPr>
+              <w:keepNext/>
               <w:jc w:val="center"/>
             </w:pPr>
             <w:r/>
@@ -3330,6 +3430,7 @@
           </w:tcPr>
           <w:p>
             <w:pPr>
+              <w:keepNext/>
               <w:jc w:val="center"/>
             </w:pPr>
             <w:r/>
@@ -3349,6 +3450,7 @@
           </w:tcPr>
           <w:p>
             <w:pPr>
+              <w:keepNext/>
               <w:jc w:val="center"/>
             </w:pPr>
             <w:r/>
@@ -3368,6 +3470,7 @@
           </w:tcPr>
           <w:p>
             <w:pPr>
+              <w:keepNext/>
               <w:jc w:val="center"/>
             </w:pPr>
             <w:r/>
@@ -3387,6 +3490,7 @@
           </w:tcPr>
           <w:p>
             <w:pPr>
+              <w:keepNext/>
               <w:jc w:val="center"/>
             </w:pPr>
             <w:r/>
@@ -3406,6 +3510,7 @@
           </w:tcPr>
           <w:p>
             <w:pPr>
+              <w:keepNext/>
               <w:jc w:val="center"/>
             </w:pPr>
             <w:r/>
@@ -3427,6 +3532,7 @@
           </w:tcPr>
           <w:p>
             <w:pPr>
+              <w:keepNext/>
               <w:jc w:val="left"/>
             </w:pPr>
             <w:r>
@@ -3451,6 +3557,7 @@
           </w:tcPr>
           <w:p>
             <w:pPr>
+              <w:keepNext/>
               <w:jc w:val="center"/>
             </w:pPr>
             <w:r>
@@ -3475,6 +3582,7 @@
           </w:tcPr>
           <w:p>
             <w:pPr>
+              <w:keepNext/>
               <w:jc w:val="center"/>
             </w:pPr>
             <w:r>
@@ -3499,6 +3607,7 @@
           </w:tcPr>
           <w:p>
             <w:pPr>
+              <w:keepNext/>
               <w:jc w:val="center"/>
             </w:pPr>
             <w:r>
@@ -3523,6 +3632,7 @@
           </w:tcPr>
           <w:p>
             <w:pPr>
+              <w:keepNext/>
               <w:jc w:val="center"/>
             </w:pPr>
             <w:r>
@@ -3547,6 +3657,7 @@
           </w:tcPr>
           <w:p>
             <w:pPr>
+              <w:keepNext/>
               <w:jc w:val="center"/>
             </w:pPr>
             <w:r>
@@ -3571,6 +3682,7 @@
           </w:tcPr>
           <w:p>
             <w:pPr>
+              <w:keepNext/>
               <w:jc w:val="center"/>
             </w:pPr>
             <w:r>
@@ -3597,6 +3709,7 @@
           </w:tcPr>
           <w:p>
             <w:pPr>
+              <w:keepNext/>
               <w:jc w:val="left"/>
             </w:pPr>
             <w:r>
@@ -3621,6 +3734,7 @@
           </w:tcPr>
           <w:p>
             <w:pPr>
+              <w:keepNext/>
               <w:jc w:val="center"/>
             </w:pPr>
             <w:r>
@@ -3645,6 +3759,7 @@
           </w:tcPr>
           <w:p>
             <w:pPr>
+              <w:keepNext/>
               <w:jc w:val="center"/>
             </w:pPr>
             <w:r>
@@ -3669,6 +3784,7 @@
           </w:tcPr>
           <w:p>
             <w:pPr>
+              <w:keepNext/>
               <w:jc w:val="center"/>
             </w:pPr>
             <w:r>
@@ -3693,6 +3809,7 @@
           </w:tcPr>
           <w:p>
             <w:pPr>
+              <w:keepNext/>
               <w:jc w:val="center"/>
             </w:pPr>
             <w:r>
@@ -3717,6 +3834,7 @@
           </w:tcPr>
           <w:p>
             <w:pPr>
+              <w:keepNext/>
               <w:jc w:val="center"/>
             </w:pPr>
             <w:r>
@@ -3741,6 +3859,7 @@
           </w:tcPr>
           <w:p>
             <w:pPr>
+              <w:keepNext/>
               <w:jc w:val="center"/>
             </w:pPr>
             <w:r>
@@ -3767,6 +3886,7 @@
           </w:tcPr>
           <w:p>
             <w:pPr>
+              <w:keepNext/>
               <w:jc w:val="left"/>
             </w:pPr>
             <w:r>
@@ -3791,6 +3911,7 @@
           </w:tcPr>
           <w:p>
             <w:pPr>
+              <w:keepNext/>
               <w:jc w:val="center"/>
             </w:pPr>
             <w:r>
@@ -3815,6 +3936,7 @@
           </w:tcPr>
           <w:p>
             <w:pPr>
+              <w:keepNext/>
               <w:jc w:val="center"/>
             </w:pPr>
             <w:r>
@@ -3839,6 +3961,7 @@
           </w:tcPr>
           <w:p>
             <w:pPr>
+              <w:keepNext/>
               <w:jc w:val="center"/>
             </w:pPr>
             <w:r>
@@ -3863,6 +3986,7 @@
           </w:tcPr>
           <w:p>
             <w:pPr>
+              <w:keepNext/>
               <w:jc w:val="center"/>
             </w:pPr>
             <w:r>
@@ -3887,6 +4011,7 @@
           </w:tcPr>
           <w:p>
             <w:pPr>
+              <w:keepNext/>
               <w:jc w:val="center"/>
             </w:pPr>
             <w:r>
@@ -3911,6 +4036,7 @@
           </w:tcPr>
           <w:p>
             <w:pPr>
+              <w:keepNext/>
               <w:jc w:val="center"/>
             </w:pPr>
             <w:r>
@@ -4022,6 +4148,7 @@
           </w:tcPr>
           <w:p>
             <w:pPr>
+              <w:keepNext/>
               <w:jc w:val="center"/>
             </w:pPr>
             <w:r/>
@@ -4041,6 +4168,7 @@
           </w:tcPr>
           <w:p>
             <w:pPr>
+              <w:keepNext/>
               <w:jc w:val="center"/>
             </w:pPr>
             <w:r/>
@@ -4060,6 +4188,7 @@
           </w:tcPr>
           <w:p>
             <w:pPr>
+              <w:keepNext/>
               <w:jc w:val="center"/>
             </w:pPr>
             <w:r/>
@@ -4081,6 +4210,7 @@
           </w:tcPr>
           <w:p>
             <w:pPr>
+              <w:keepNext/>
               <w:jc w:val="left"/>
             </w:pPr>
             <w:r>
@@ -4105,6 +4235,7 @@
           </w:tcPr>
           <w:p>
             <w:pPr>
+              <w:keepNext/>
               <w:jc w:val="center"/>
             </w:pPr>
             <w:r>
@@ -4129,6 +4260,7 @@
           </w:tcPr>
           <w:p>
             <w:pPr>
+              <w:keepNext/>
               <w:jc w:val="center"/>
             </w:pPr>
             <w:r>
@@ -4155,6 +4287,7 @@
           </w:tcPr>
           <w:p>
             <w:pPr>
+              <w:keepNext/>
               <w:jc w:val="left"/>
             </w:pPr>
             <w:r>
@@ -4179,6 +4312,7 @@
           </w:tcPr>
           <w:p>
             <w:pPr>
+              <w:keepNext/>
               <w:jc w:val="center"/>
             </w:pPr>
             <w:r>
@@ -4203,6 +4337,7 @@
           </w:tcPr>
           <w:p>
             <w:pPr>
+              <w:keepNext/>
               <w:jc w:val="center"/>
             </w:pPr>
             <w:r>
@@ -4229,6 +4364,7 @@
           </w:tcPr>
           <w:p>
             <w:pPr>
+              <w:keepNext/>
               <w:jc w:val="left"/>
             </w:pPr>
             <w:r>
@@ -4253,6 +4389,7 @@
           </w:tcPr>
           <w:p>
             <w:pPr>
+              <w:keepNext/>
               <w:jc w:val="center"/>
             </w:pPr>
             <w:r>
@@ -4277,6 +4414,7 @@
           </w:tcPr>
           <w:p>
             <w:pPr>
+              <w:keepNext/>
               <w:jc w:val="center"/>
             </w:pPr>
             <w:r>
@@ -4347,6 +4485,7 @@
           </w:tcPr>
           <w:p>
             <w:pPr>
+              <w:keepNext/>
               <w:jc w:val="center"/>
             </w:pPr>
             <w:r/>
@@ -4366,6 +4505,7 @@
           </w:tcPr>
           <w:p>
             <w:pPr>
+              <w:keepNext/>
               <w:jc w:val="center"/>
             </w:pPr>
             <w:r/>
@@ -4385,6 +4525,7 @@
           </w:tcPr>
           <w:p>
             <w:pPr>
+              <w:keepNext/>
               <w:jc w:val="center"/>
             </w:pPr>
             <w:r/>
@@ -4406,6 +4547,7 @@
           </w:tcPr>
           <w:p>
             <w:pPr>
+              <w:keepNext/>
               <w:jc w:val="left"/>
             </w:pPr>
             <w:r>
@@ -4430,6 +4572,7 @@
           </w:tcPr>
           <w:p>
             <w:pPr>
+              <w:keepNext/>
               <w:jc w:val="center"/>
             </w:pPr>
             <w:r>
@@ -4454,6 +4597,7 @@
           </w:tcPr>
           <w:p>
             <w:pPr>
+              <w:keepNext/>
               <w:jc w:val="center"/>
             </w:pPr>
             <w:r>
@@ -4480,6 +4624,7 @@
           </w:tcPr>
           <w:p>
             <w:pPr>
+              <w:keepNext/>
               <w:jc w:val="left"/>
             </w:pPr>
             <w:r>
@@ -4504,6 +4649,7 @@
           </w:tcPr>
           <w:p>
             <w:pPr>
+              <w:keepNext/>
               <w:jc w:val="center"/>
             </w:pPr>
             <w:r>
@@ -4528,6 +4674,7 @@
           </w:tcPr>
           <w:p>
             <w:pPr>
+              <w:keepNext/>
               <w:jc w:val="center"/>
             </w:pPr>
             <w:r>
@@ -4554,6 +4701,7 @@
           </w:tcPr>
           <w:p>
             <w:pPr>
+              <w:keepNext/>
               <w:jc w:val="left"/>
             </w:pPr>
             <w:r>
@@ -4578,6 +4726,7 @@
           </w:tcPr>
           <w:p>
             <w:pPr>
+              <w:keepNext/>
               <w:jc w:val="center"/>
             </w:pPr>
             <w:r>
@@ -4602,6 +4751,7 @@
           </w:tcPr>
           <w:p>
             <w:pPr>
+              <w:keepNext/>
               <w:jc w:val="center"/>
             </w:pPr>
             <w:r>
@@ -4683,6 +4833,7 @@
           </w:tcPr>
           <w:p>
             <w:pPr>
+              <w:keepNext/>
               <w:jc w:val="center"/>
             </w:pPr>
             <w:r/>
@@ -4702,6 +4853,7 @@
           </w:tcPr>
           <w:p>
             <w:pPr>
+              <w:keepNext/>
               <w:jc w:val="center"/>
             </w:pPr>
             <w:r/>
@@ -4721,6 +4873,7 @@
           </w:tcPr>
           <w:p>
             <w:pPr>
+              <w:keepNext/>
               <w:jc w:val="center"/>
             </w:pPr>
             <w:r/>
@@ -4742,6 +4895,7 @@
           </w:tcPr>
           <w:p>
             <w:pPr>
+              <w:keepNext/>
               <w:jc w:val="left"/>
             </w:pPr>
             <w:r>
@@ -4766,6 +4920,7 @@
           </w:tcPr>
           <w:p>
             <w:pPr>
+              <w:keepNext/>
               <w:jc w:val="center"/>
             </w:pPr>
             <w:r>
@@ -4790,6 +4945,7 @@
           </w:tcPr>
           <w:p>
             <w:pPr>
+              <w:keepNext/>
               <w:jc w:val="center"/>
             </w:pPr>
             <w:r>
@@ -4816,6 +4972,7 @@
           </w:tcPr>
           <w:p>
             <w:pPr>
+              <w:keepNext/>
               <w:jc w:val="left"/>
             </w:pPr>
             <w:r>
@@ -4840,6 +4997,7 @@
           </w:tcPr>
           <w:p>
             <w:pPr>
+              <w:keepNext/>
               <w:jc w:val="center"/>
             </w:pPr>
             <w:r>
@@ -4864,6 +5022,7 @@
           </w:tcPr>
           <w:p>
             <w:pPr>
+              <w:keepNext/>
               <w:jc w:val="center"/>
             </w:pPr>
             <w:r>
@@ -4890,6 +5049,7 @@
           </w:tcPr>
           <w:p>
             <w:pPr>
+              <w:keepNext/>
               <w:jc w:val="left"/>
             </w:pPr>
             <w:r>
@@ -4914,6 +5074,7 @@
           </w:tcPr>
           <w:p>
             <w:pPr>
+              <w:keepNext/>
               <w:jc w:val="center"/>
             </w:pPr>
             <w:r>
@@ -4938,6 +5099,7 @@
           </w:tcPr>
           <w:p>
             <w:pPr>
+              <w:keepNext/>
               <w:jc w:val="center"/>
             </w:pPr>
             <w:r>
@@ -4964,6 +5126,7 @@
           </w:tcPr>
           <w:p>
             <w:pPr>
+              <w:keepNext/>
               <w:jc w:val="left"/>
             </w:pPr>
             <w:r>
@@ -4988,6 +5151,7 @@
           </w:tcPr>
           <w:p>
             <w:pPr>
+              <w:keepNext/>
               <w:jc w:val="center"/>
             </w:pPr>
             <w:r>
@@ -5012,6 +5176,7 @@
           </w:tcPr>
           <w:p>
             <w:pPr>
+              <w:keepNext/>
               <w:jc w:val="center"/>
             </w:pPr>
             <w:r>
@@ -5131,6 +5296,7 @@
           </w:tcPr>
           <w:p>
             <w:pPr>
+              <w:keepNext/>
               <w:jc w:val="center"/>
             </w:pPr>
             <w:r/>
@@ -5150,6 +5316,7 @@
           </w:tcPr>
           <w:p>
             <w:pPr>
+              <w:keepNext/>
               <w:jc w:val="center"/>
             </w:pPr>
             <w:r/>
@@ -5169,6 +5336,7 @@
           </w:tcPr>
           <w:p>
             <w:pPr>
+              <w:keepNext/>
               <w:jc w:val="center"/>
             </w:pPr>
             <w:r/>
@@ -5188,6 +5356,7 @@
           </w:tcPr>
           <w:p>
             <w:pPr>
+              <w:keepNext/>
               <w:jc w:val="center"/>
             </w:pPr>
             <w:r/>
@@ -5209,6 +5378,7 @@
           </w:tcPr>
           <w:p>
             <w:pPr>
+              <w:keepNext/>
               <w:jc w:val="left"/>
             </w:pPr>
             <w:r>
@@ -5233,6 +5403,7 @@
           </w:tcPr>
           <w:p>
             <w:pPr>
+              <w:keepNext/>
               <w:jc w:val="center"/>
             </w:pPr>
             <w:r>
@@ -5257,6 +5428,7 @@
           </w:tcPr>
           <w:p>
             <w:pPr>
+              <w:keepNext/>
               <w:jc w:val="center"/>
             </w:pPr>
             <w:r>
@@ -5281,6 +5453,7 @@
           </w:tcPr>
           <w:p>
             <w:pPr>
+              <w:keepNext/>
               <w:jc w:val="center"/>
             </w:pPr>
             <w:r>
@@ -5307,6 +5480,7 @@
           </w:tcPr>
           <w:p>
             <w:pPr>
+              <w:keepNext/>
               <w:jc w:val="left"/>
             </w:pPr>
             <w:r>
@@ -5331,6 +5505,7 @@
           </w:tcPr>
           <w:p>
             <w:pPr>
+              <w:keepNext/>
               <w:jc w:val="center"/>
             </w:pPr>
             <w:r>
@@ -5355,6 +5530,7 @@
           </w:tcPr>
           <w:p>
             <w:pPr>
+              <w:keepNext/>
               <w:jc w:val="center"/>
             </w:pPr>
             <w:r>
@@ -5379,6 +5555,7 @@
           </w:tcPr>
           <w:p>
             <w:pPr>
+              <w:keepNext/>
               <w:jc w:val="center"/>
             </w:pPr>
             <w:r>
@@ -5434,6 +5611,7 @@
           </w:tcPr>
           <w:p>
             <w:pPr>
+              <w:keepNext/>
               <w:jc w:val="center"/>
             </w:pPr>
             <w:r/>
@@ -5453,6 +5631,7 @@
           </w:tcPr>
           <w:p>
             <w:pPr>
+              <w:keepNext/>
               <w:jc w:val="center"/>
             </w:pPr>
             <w:r/>
@@ -5472,6 +5651,7 @@
           </w:tcPr>
           <w:p>
             <w:pPr>
+              <w:keepNext/>
               <w:jc w:val="center"/>
             </w:pPr>
             <w:r/>
@@ -5491,6 +5671,7 @@
           </w:tcPr>
           <w:p>
             <w:pPr>
+              <w:keepNext/>
               <w:jc w:val="center"/>
             </w:pPr>
             <w:r/>
@@ -5510,6 +5691,7 @@
           </w:tcPr>
           <w:p>
             <w:pPr>
+              <w:keepNext/>
               <w:jc w:val="center"/>
             </w:pPr>
             <w:r/>
@@ -5531,6 +5713,7 @@
           </w:tcPr>
           <w:p>
             <w:pPr>
+              <w:keepNext/>
               <w:jc w:val="left"/>
             </w:pPr>
             <w:r>
@@ -5555,6 +5738,7 @@
           </w:tcPr>
           <w:p>
             <w:pPr>
+              <w:keepNext/>
               <w:jc w:val="center"/>
             </w:pPr>
             <w:r>
@@ -5579,6 +5763,7 @@
           </w:tcPr>
           <w:p>
             <w:pPr>
+              <w:keepNext/>
               <w:jc w:val="center"/>
             </w:pPr>
             <w:r>
@@ -5603,6 +5788,7 @@
           </w:tcPr>
           <w:p>
             <w:pPr>
+              <w:keepNext/>
               <w:jc w:val="center"/>
             </w:pPr>
             <w:r>
@@ -5627,6 +5813,7 @@
           </w:tcPr>
           <w:p>
             <w:pPr>
+              <w:keepNext/>
               <w:jc w:val="center"/>
             </w:pPr>
             <w:r>
@@ -5653,6 +5840,7 @@
           </w:tcPr>
           <w:p>
             <w:pPr>
+              <w:keepNext/>
               <w:jc w:val="left"/>
             </w:pPr>
             <w:r>
@@ -5677,6 +5865,7 @@
           </w:tcPr>
           <w:p>
             <w:pPr>
+              <w:keepNext/>
               <w:jc w:val="center"/>
             </w:pPr>
             <w:r>
@@ -5701,6 +5890,7 @@
           </w:tcPr>
           <w:p>
             <w:pPr>
+              <w:keepNext/>
               <w:jc w:val="center"/>
             </w:pPr>
             <w:r>
@@ -5725,6 +5915,7 @@
           </w:tcPr>
           <w:p>
             <w:pPr>
+              <w:keepNext/>
               <w:jc w:val="center"/>
             </w:pPr>
             <w:r>
@@ -5749,6 +5940,7 @@
           </w:tcPr>
           <w:p>
             <w:pPr>
+              <w:keepNext/>
               <w:jc w:val="center"/>
             </w:pPr>
             <w:r>
@@ -5903,6 +6095,7 @@
           </w:tcPr>
           <w:p>
             <w:pPr>
+              <w:keepNext/>
               <w:jc w:val="center"/>
             </w:pPr>
             <w:r/>
@@ -5922,6 +6115,7 @@
           </w:tcPr>
           <w:p>
             <w:pPr>
+              <w:keepNext/>
               <w:jc w:val="center"/>
             </w:pPr>
             <w:r/>
@@ -5941,6 +6135,7 @@
           </w:tcPr>
           <w:p>
             <w:pPr>
+              <w:keepNext/>
               <w:jc w:val="center"/>
             </w:pPr>
             <w:r/>
@@ -5960,6 +6155,7 @@
           </w:tcPr>
           <w:p>
             <w:pPr>
+              <w:keepNext/>
               <w:jc w:val="center"/>
             </w:pPr>
             <w:r/>
@@ -5981,6 +6177,7 @@
           </w:tcPr>
           <w:p>
             <w:pPr>
+              <w:keepNext/>
               <w:jc w:val="left"/>
             </w:pPr>
             <w:r>
@@ -6005,6 +6202,7 @@
           </w:tcPr>
           <w:p>
             <w:pPr>
+              <w:keepNext/>
               <w:jc w:val="center"/>
             </w:pPr>
             <w:r>
@@ -6029,6 +6227,7 @@
           </w:tcPr>
           <w:p>
             <w:pPr>
+              <w:keepNext/>
               <w:jc w:val="center"/>
             </w:pPr>
             <w:r>
@@ -6053,6 +6252,7 @@
           </w:tcPr>
           <w:p>
             <w:pPr>
+              <w:keepNext/>
               <w:jc w:val="center"/>
             </w:pPr>
             <w:r>
@@ -6079,6 +6279,7 @@
           </w:tcPr>
           <w:p>
             <w:pPr>
+              <w:keepNext/>
               <w:jc w:val="left"/>
             </w:pPr>
             <w:r>
@@ -6103,6 +6304,7 @@
           </w:tcPr>
           <w:p>
             <w:pPr>
+              <w:keepNext/>
               <w:jc w:val="center"/>
             </w:pPr>
             <w:r>
@@ -6127,6 +6329,7 @@
           </w:tcPr>
           <w:p>
             <w:pPr>
+              <w:keepNext/>
               <w:jc w:val="center"/>
             </w:pPr>
             <w:r>
@@ -6151,6 +6354,7 @@
           </w:tcPr>
           <w:p>
             <w:pPr>
+              <w:keepNext/>
               <w:jc w:val="center"/>
             </w:pPr>
             <w:r>
@@ -6177,6 +6381,7 @@
           </w:tcPr>
           <w:p>
             <w:pPr>
+              <w:keepNext/>
               <w:jc w:val="left"/>
             </w:pPr>
             <w:r>
@@ -6201,6 +6406,7 @@
           </w:tcPr>
           <w:p>
             <w:pPr>
+              <w:keepNext/>
               <w:jc w:val="center"/>
             </w:pPr>
             <w:r>
@@ -6225,6 +6431,7 @@
           </w:tcPr>
           <w:p>
             <w:pPr>
+              <w:keepNext/>
               <w:jc w:val="center"/>
             </w:pPr>
             <w:r>
@@ -6249,6 +6456,7 @@
           </w:tcPr>
           <w:p>
             <w:pPr>
+              <w:keepNext/>
               <w:jc w:val="center"/>
             </w:pPr>
             <w:r>
@@ -6362,6 +6570,7 @@
           </w:tcPr>
           <w:p>
             <w:pPr>
+              <w:keepNext/>
               <w:jc w:val="center"/>
             </w:pPr>
             <w:r/>
@@ -6381,6 +6590,7 @@
           </w:tcPr>
           <w:p>
             <w:pPr>
+              <w:keepNext/>
               <w:jc w:val="center"/>
             </w:pPr>
             <w:r/>
@@ -6400,6 +6610,7 @@
           </w:tcPr>
           <w:p>
             <w:pPr>
+              <w:keepNext/>
               <w:jc w:val="center"/>
             </w:pPr>
             <w:r/>
@@ -6419,6 +6630,7 @@
           </w:tcPr>
           <w:p>
             <w:pPr>
+              <w:keepNext/>
               <w:jc w:val="center"/>
             </w:pPr>
             <w:r/>
@@ -6438,6 +6650,7 @@
           </w:tcPr>
           <w:p>
             <w:pPr>
+              <w:keepNext/>
               <w:jc w:val="center"/>
             </w:pPr>
             <w:r/>
@@ -6457,6 +6670,7 @@
           </w:tcPr>
           <w:p>
             <w:pPr>
+              <w:keepNext/>
               <w:jc w:val="center"/>
             </w:pPr>
             <w:r/>
@@ -6478,6 +6692,7 @@
           </w:tcPr>
           <w:p>
             <w:pPr>
+              <w:keepNext/>
               <w:jc w:val="left"/>
             </w:pPr>
             <w:r>
@@ -6502,6 +6717,7 @@
           </w:tcPr>
           <w:p>
             <w:pPr>
+              <w:keepNext/>
               <w:jc w:val="center"/>
             </w:pPr>
             <w:r>
@@ -6526,6 +6742,7 @@
           </w:tcPr>
           <w:p>
             <w:pPr>
+              <w:keepNext/>
               <w:jc w:val="center"/>
             </w:pPr>
             <w:r>
@@ -6550,6 +6767,7 @@
           </w:tcPr>
           <w:p>
             <w:pPr>
+              <w:keepNext/>
               <w:jc w:val="center"/>
             </w:pPr>
             <w:r>
@@ -6574,6 +6792,7 @@
           </w:tcPr>
           <w:p>
             <w:pPr>
+              <w:keepNext/>
               <w:jc w:val="center"/>
             </w:pPr>
             <w:r>
@@ -6598,6 +6817,7 @@
           </w:tcPr>
           <w:p>
             <w:pPr>
+              <w:keepNext/>
               <w:jc w:val="center"/>
             </w:pPr>
             <w:r>
@@ -6624,6 +6844,7 @@
           </w:tcPr>
           <w:p>
             <w:pPr>
+              <w:keepNext/>
               <w:jc w:val="left"/>
             </w:pPr>
             <w:r>
@@ -6648,6 +6869,7 @@
           </w:tcPr>
           <w:p>
             <w:pPr>
+              <w:keepNext/>
               <w:jc w:val="center"/>
             </w:pPr>
             <w:r>
@@ -6672,6 +6894,7 @@
           </w:tcPr>
           <w:p>
             <w:pPr>
+              <w:keepNext/>
               <w:jc w:val="center"/>
             </w:pPr>
             <w:r>
@@ -6696,6 +6919,7 @@
           </w:tcPr>
           <w:p>
             <w:pPr>
+              <w:keepNext/>
               <w:jc w:val="center"/>
             </w:pPr>
             <w:r>
@@ -6720,6 +6944,7 @@
           </w:tcPr>
           <w:p>
             <w:pPr>
+              <w:keepNext/>
               <w:jc w:val="center"/>
             </w:pPr>
             <w:r>
@@ -6744,6 +6969,7 @@
           </w:tcPr>
           <w:p>
             <w:pPr>
+              <w:keepNext/>
               <w:jc w:val="center"/>
             </w:pPr>
             <w:r>
@@ -6770,6 +6996,7 @@
           </w:tcPr>
           <w:p>
             <w:pPr>
+              <w:keepNext/>
               <w:jc w:val="left"/>
             </w:pPr>
             <w:r>
@@ -6794,6 +7021,7 @@
           </w:tcPr>
           <w:p>
             <w:pPr>
+              <w:keepNext/>
               <w:jc w:val="center"/>
             </w:pPr>
             <w:r>
@@ -6818,6 +7046,7 @@
           </w:tcPr>
           <w:p>
             <w:pPr>
+              <w:keepNext/>
               <w:jc w:val="center"/>
             </w:pPr>
             <w:r>
@@ -6842,6 +7071,7 @@
           </w:tcPr>
           <w:p>
             <w:pPr>
+              <w:keepNext/>
               <w:jc w:val="center"/>
             </w:pPr>
             <w:r>
@@ -6866,6 +7096,7 @@
           </w:tcPr>
           <w:p>
             <w:pPr>
+              <w:keepNext/>
               <w:jc w:val="center"/>
             </w:pPr>
             <w:r>
@@ -6890,6 +7121,7 @@
           </w:tcPr>
           <w:p>
             <w:pPr>
+              <w:keepNext/>
               <w:jc w:val="center"/>
             </w:pPr>
             <w:r>
@@ -6916,6 +7148,7 @@
           </w:tcPr>
           <w:p>
             <w:pPr>
+              <w:keepNext/>
               <w:jc w:val="left"/>
             </w:pPr>
             <w:r>
@@ -6940,6 +7173,7 @@
           </w:tcPr>
           <w:p>
             <w:pPr>
+              <w:keepNext/>
               <w:jc w:val="center"/>
             </w:pPr>
             <w:r>
@@ -6964,6 +7198,7 @@
           </w:tcPr>
           <w:p>
             <w:pPr>
+              <w:keepNext/>
               <w:jc w:val="center"/>
             </w:pPr>
             <w:r>
@@ -6988,6 +7223,7 @@
           </w:tcPr>
           <w:p>
             <w:pPr>
+              <w:keepNext/>
               <w:jc w:val="center"/>
             </w:pPr>
             <w:r>
@@ -7012,6 +7248,7 @@
           </w:tcPr>
           <w:p>
             <w:pPr>
+              <w:keepNext/>
               <w:jc w:val="center"/>
             </w:pPr>
             <w:r>
@@ -7036,6 +7273,7 @@
           </w:tcPr>
           <w:p>
             <w:pPr>
+              <w:keepNext/>
               <w:jc w:val="center"/>
             </w:pPr>
             <w:r>
@@ -7062,6 +7300,7 @@
           </w:tcPr>
           <w:p>
             <w:pPr>
+              <w:keepNext/>
               <w:jc w:val="left"/>
             </w:pPr>
             <w:r>
@@ -7086,6 +7325,7 @@
           </w:tcPr>
           <w:p>
             <w:pPr>
+              <w:keepNext/>
               <w:jc w:val="center"/>
             </w:pPr>
             <w:r>
@@ -7110,6 +7350,7 @@
           </w:tcPr>
           <w:p>
             <w:pPr>
+              <w:keepNext/>
               <w:jc w:val="center"/>
             </w:pPr>
             <w:r>
@@ -7134,6 +7375,7 @@
           </w:tcPr>
           <w:p>
             <w:pPr>
+              <w:keepNext/>
               <w:jc w:val="center"/>
             </w:pPr>
             <w:r>
@@ -7158,6 +7400,7 @@
           </w:tcPr>
           <w:p>
             <w:pPr>
+              <w:keepNext/>
               <w:jc w:val="center"/>
             </w:pPr>
             <w:r>
@@ -7182,6 +7425,7 @@
           </w:tcPr>
           <w:p>
             <w:pPr>
+              <w:keepNext/>
               <w:jc w:val="center"/>
             </w:pPr>
             <w:r>

</xml_diff>